<commit_message>
publish student projects (Fall 2026) 2026-09-22 21:23
</commit_message>
<xml_diff>
--- a/Visualization-Analytics/beans.docx
+++ b/Visualization-Analytics/beans.docx
@@ -2635,7 +2635,7 @@
         <w:t xml:space="preserve"> </w:t>
       </w:r>
       <w:r>
-        <w:t xml:space="preserve">6 CS + 2 Design + 1 Art (9) — a data product lives on</w:t>
+        <w:t xml:space="preserve">6 CS + 2 Design + 0 Art (8) — a data product lives on</w:t>
       </w:r>
       <w:r>
         <w:t xml:space="preserve"> </w:t>
@@ -2647,7 +2647,7 @@
         <w:t xml:space="preserve">UX and information design</w:t>
       </w:r>
       <w:r>
-        <w:t xml:space="preserve">: the explore/diagnose/recommend flows, the view/drill-down architecture, the metric/threshold (taste-model) design, the data storytelling and the shop/community UX are a large surface for two designers; the art surface is comparatively small (perceptual palette, chart styling, iconography, dense-view UI) and suits one artist (rules: min 1 Design mandated, max 9 total, D+A ≤ 3; see</w:t>
+        <w:t xml:space="preserve">: the explore/diagnose/recommend flows, the view/drill-down architecture, the metric/threshold (taste-model) design, the data storytelling and the shop/community UX are a large surface for two designers (rules: min 1 Design mandated, max 9 total, D+A ≤ 3; see</w:t>
       </w:r>
       <w:r>
         <w:t xml:space="preserve"> </w:t>
@@ -2659,7 +2659,52 @@
         <w:t xml:space="preserve">team-formation.pdf</w:t>
       </w:r>
       <w:r>
-        <w:t xml:space="preserve">). If the databank/UX outgrows two designers, that is the place to add, not art.</w:t>
+        <w:t xml:space="preserve">).</w:t>
+      </w:r>
+      <w:r>
+        <w:t xml:space="preserve"> </w:t>
+      </w:r>
+      <w:r>
+        <w:rPr>
+          <w:b/>
+        </w:rPr>
+        <w:t xml:space="preserve">Art-risk flag:</w:t>
+      </w:r>
+      <w:r>
+        <w:t xml:space="preserve"> </w:t>
+      </w:r>
+      <w:r>
+        <w:t xml:space="preserve">the art surface is comparatively small (perceptual palette, chart styling, iconography, dense-view UI) but real — with</w:t>
+      </w:r>
+      <w:r>
+        <w:t xml:space="preserve"> </w:t>
+      </w:r>
+      <w:r>
+        <w:rPr>
+          <w:b/>
+        </w:rPr>
+        <w:t xml:space="preserve">0 artists</w:t>
+      </w:r>
+      <w:r>
+        <w:t xml:space="preserve"> </w:t>
+      </w:r>
+      <w:r>
+        <w:t xml:space="preserve">it is owned by the designers through the</w:t>
+      </w:r>
+      <w:r>
+        <w:t xml:space="preserve"> </w:t>
+      </w:r>
+      <w:r>
+        <w:rPr>
+          <w:b/>
+        </w:rPr>
+        <w:t xml:space="preserve">D11 conditional</w:t>
+      </w:r>
+      <w:r>
+        <w:t xml:space="preserve"> </w:t>
+      </w:r>
+      <w:r>
+        <w:t xml:space="preserve">(Art Proof of Concept M1 / Art Implementation Quality M2, the last Design goal each milestone). This is the lower-risk category for going art-less (no hand-modelled assets — the payload is a palette + chart styling + icons), but a colorblind-safe perceptual palette and legible dense charts still need real visual-design effort; scope it hard under D11, or add an artist within D+A ≤ 3.</w:t>
       </w:r>
       <w:r>
         <w:t xml:space="preserve"> </w:t>
@@ -2772,6 +2817,18 @@
     <w:p>
       <w:pPr>
         <w:numPr>
+          <w:ilvl w:val="1"/>
+          <w:numId w:val="1019"/>
+        </w:numPr>
+        <w:pStyle w:val="Compact"/>
+      </w:pPr>
+      <w:r>
+        <w:t xml:space="preserve">M1D11 Art Proof of Concept (conditional — 0-artist team, Design-owned): the data-product visual language — colorblind-safe perceptual palette, chart/radar styling, control iconography, dial-in highlight VFX and dense-view UI; 2 mockup screens</w:t>
+      </w:r>
+    </w:p>
+    <w:p>
+      <w:pPr>
+        <w:numPr>
           <w:ilvl w:val="0"/>
           <w:numId w:val="1018"/>
         </w:numPr>
@@ -2829,7 +2886,7 @@
         <w:pStyle w:val="Compact"/>
       </w:pPr>
       <w:r>
-        <w:t xml:space="preserve">M2D8 Feedback Pass — clarity pass (density without chart junk; the dial-in correction moment unmistakable)</w:t>
+        <w:t xml:space="preserve">M2D11 Art Implementation Quality (conditional — 0-artist team, Design-owned): all in-app art implemented in-engine, no placeholders — the palette system, chart/radar styling, iconography, dial-in/match highlight VFX and dense-view UI</w:t>
       </w:r>
     </w:p>
     <w:p>
@@ -2964,49 +3021,67 @@
         <w:rPr>
           <w:b/>
         </w:rPr>
-        <w:t xml:space="preserve">Art M1:</w:t>
-      </w:r>
-      <w:r>
-        <w:t xml:space="preserve"> </w:t>
-      </w:r>
-      <w:r>
-        <w:t xml:space="preserve">1 artist (data-product visual language — palette, chart styling, iconography, dense-view UI)</w:t>
-      </w:r>
-    </w:p>
-    <w:p>
-      <w:pPr>
-        <w:numPr>
-          <w:ilvl w:val="1"/>
-          <w:numId w:val="1023"/>
-        </w:numPr>
-        <w:pStyle w:val="Compact"/>
-      </w:pPr>
-      <w:r>
-        <w:t xml:space="preserve">M1A1 ⭐ Art Bible / Proof of Concept (the data-product visual language: perceptual palettes, chart styling, iconography; mockups = the visualizer view + a bean/catalog view)</w:t>
-      </w:r>
-    </w:p>
-    <w:p>
-      <w:pPr>
-        <w:numPr>
-          <w:ilvl w:val="1"/>
-          <w:numId w:val="1023"/>
-        </w:numPr>
-        <w:pStyle w:val="Compact"/>
-      </w:pPr>
-      <w:r>
-        <w:t xml:space="preserve">M1A3 Environment, Props &amp; VFX Concepts (chart/backdrop styling + highlight-VFX concepts — the dial-in correction highlight)</w:t>
-      </w:r>
-    </w:p>
-    <w:p>
-      <w:pPr>
-        <w:numPr>
-          <w:ilvl w:val="1"/>
-          <w:numId w:val="1023"/>
-        </w:numPr>
-        <w:pStyle w:val="Compact"/>
-      </w:pPr>
-      <w:r>
-        <w:t xml:space="preserve">M1A4 UI Art Concepts &amp; Typography (chart legends, control iconography, dense-view legibility)</w:t>
+        <w:t xml:space="preserve">Art:</w:t>
+      </w:r>
+      <w:r>
+        <w:t xml:space="preserve"> </w:t>
+      </w:r>
+      <w:r>
+        <w:rPr>
+          <w:i/>
+        </w:rPr>
+        <w:t xml:space="preserve">no artist on this team (0 Art).</w:t>
+      </w:r>
+      <w:r>
+        <w:t xml:space="preserve"> </w:t>
+      </w:r>
+      <w:r>
+        <w:t xml:space="preserve">The data-product visual language (colorblind-safe perceptual palette, chart/radar styling, control iconography, dial-in highlight VFX and dense-view UI) is owned by the designers through the</w:t>
+      </w:r>
+      <w:r>
+        <w:t xml:space="preserve"> </w:t>
+      </w:r>
+      <w:r>
+        <w:rPr>
+          <w:b/>
+        </w:rPr>
+        <w:t xml:space="preserve">D11 conditional</w:t>
+      </w:r>
+      <w:r>
+        <w:t xml:space="preserve"> </w:t>
+      </w:r>
+      <w:r>
+        <w:t xml:space="preserve">—</w:t>
+      </w:r>
+      <w:r>
+        <w:t xml:space="preserve"> </w:t>
+      </w:r>
+      <w:r>
+        <w:rPr>
+          <w:b/>
+        </w:rPr>
+        <w:t xml:space="preserve">M1D11 Art Proof of Concept</w:t>
+      </w:r>
+      <w:r>
+        <w:t xml:space="preserve"> </w:t>
+      </w:r>
+      <w:r>
+        <w:t xml:space="preserve">(visual direction + 2 mockups) and</w:t>
+      </w:r>
+      <w:r>
+        <w:t xml:space="preserve"> </w:t>
+      </w:r>
+      <w:r>
+        <w:rPr>
+          <w:b/>
+        </w:rPr>
+        <w:t xml:space="preserve">M2D11 Art Implementation Quality</w:t>
+      </w:r>
+      <w:r>
+        <w:t xml:space="preserve"> </w:t>
+      </w:r>
+      <w:r>
+        <w:t xml:space="preserve">(all art in-engine, no placeholders), shown above as the last Design goal each milestone. There are no hand-modelled assets, but a legible, accessible palette + chart styling still needs real visual-design effort. Scope art hard, or add an artist within D+A ≤ 3.</w:t>
       </w:r>
     </w:p>
     <w:p>
@@ -3021,43 +3096,31 @@
         <w:rPr>
           <w:b/>
         </w:rPr>
-        <w:t xml:space="preserve">Art M2:</w:t>
-      </w:r>
-    </w:p>
-    <w:p>
-      <w:pPr>
-        <w:numPr>
-          <w:ilvl w:val="1"/>
-          <w:numId w:val="1024"/>
-        </w:numPr>
-        <w:pStyle w:val="Compact"/>
-      </w:pPr>
-      <w:r>
-        <w:t xml:space="preserve">M2A1 ⭐ Critical Asset Production &amp; In-Engine Visual Quality (the palette system, chart styling and iconography completed in-engine)</w:t>
-      </w:r>
-    </w:p>
-    <w:p>
-      <w:pPr>
-        <w:numPr>
-          <w:ilvl w:val="1"/>
-          <w:numId w:val="1024"/>
-        </w:numPr>
-        <w:pStyle w:val="Compact"/>
-      </w:pPr>
-      <w:r>
-        <w:t xml:space="preserve">M2A4 UI Art — States &amp; Feedback (filter/brush/dial-in/alert feedback, legend and control polish)</w:t>
-      </w:r>
-    </w:p>
-    <w:p>
-      <w:pPr>
-        <w:numPr>
-          <w:ilvl w:val="1"/>
-          <w:numId w:val="1024"/>
-        </w:numPr>
-        <w:pStyle w:val="Compact"/>
-      </w:pPr>
-      <w:r>
-        <w:t xml:space="preserve">M2A5 VFX — Critical Effects &amp; Transitions (highlight effects — a dial-in correction landing, a notable taste match)</w:t>
+        <w:t xml:space="preserve">TEAM M1:</w:t>
+      </w:r>
+    </w:p>
+    <w:p>
+      <w:pPr>
+        <w:numPr>
+          <w:ilvl w:val="1"/>
+          <w:numId w:val="1023"/>
+        </w:numPr>
+        <w:pStyle w:val="Compact"/>
+      </w:pPr>
+      <w:r>
+        <w:t xml:space="preserve">M1TA1 ⭐ Overall Audio Experience — light, functional audio present &amp; working (subtle UI / confirmation / dial-in-success cues), suitable and correctly triggered (a lecturer waiver on BGM may apply for this data utility).</w:t>
+      </w:r>
+    </w:p>
+    <w:p>
+      <w:pPr>
+        <w:numPr>
+          <w:ilvl w:val="1"/>
+          <w:numId w:val="1023"/>
+        </w:numPr>
+        <w:pStyle w:val="Compact"/>
+      </w:pPr>
+      <w:r>
+        <w:t xml:space="preserve">M1TA2 ⭐ Audio Engine Functionality — data-driven audio pipeline (add/replace files without recompiling) + reliable multi-channel playback.</w:t>
       </w:r>
     </w:p>
     <w:p>
@@ -3072,45 +3135,6 @@
         <w:rPr>
           <w:b/>
         </w:rPr>
-        <w:t xml:space="preserve">TEAM M1:</w:t>
-      </w:r>
-    </w:p>
-    <w:p>
-      <w:pPr>
-        <w:numPr>
-          <w:ilvl w:val="1"/>
-          <w:numId w:val="1025"/>
-        </w:numPr>
-        <w:pStyle w:val="Compact"/>
-      </w:pPr>
-      <w:r>
-        <w:t xml:space="preserve">M1TA1 ⭐ Overall Audio Experience — light, functional audio present &amp; working (subtle UI / confirmation / dial-in-success cues), suitable and correctly triggered (a lecturer waiver on BGM may apply for this data utility).</w:t>
-      </w:r>
-    </w:p>
-    <w:p>
-      <w:pPr>
-        <w:numPr>
-          <w:ilvl w:val="1"/>
-          <w:numId w:val="1025"/>
-        </w:numPr>
-        <w:pStyle w:val="Compact"/>
-      </w:pPr>
-      <w:r>
-        <w:t xml:space="preserve">M1TA2 ⭐ Audio Engine Functionality — data-driven audio pipeline (add/replace files without recompiling) + reliable multi-channel playback.</w:t>
-      </w:r>
-    </w:p>
-    <w:p>
-      <w:pPr>
-        <w:numPr>
-          <w:ilvl w:val="0"/>
-          <w:numId w:val="1018"/>
-        </w:numPr>
-        <w:pStyle w:val="Compact"/>
-      </w:pPr>
-      <w:r>
-        <w:rPr>
-          <w:b/>
-        </w:rPr>
         <w:t xml:space="preserve">TEAM M2:</w:t>
       </w:r>
     </w:p>
@@ -3118,7 +3142,7 @@
       <w:pPr>
         <w:numPr>
           <w:ilvl w:val="1"/>
-          <w:numId w:val="1026"/>
+          <w:numId w:val="1024"/>
         </w:numPr>
         <w:pStyle w:val="Compact"/>
       </w:pPr>
@@ -3130,7 +3154,7 @@
       <w:pPr>
         <w:numPr>
           <w:ilvl w:val="1"/>
-          <w:numId w:val="1026"/>
+          <w:numId w:val="1024"/>
         </w:numPr>
         <w:pStyle w:val="Compact"/>
       </w:pPr>
@@ -3142,7 +3166,7 @@
       <w:pPr>
         <w:numPr>
           <w:ilvl w:val="1"/>
-          <w:numId w:val="1026"/>
+          <w:numId w:val="1024"/>
         </w:numPr>
         <w:pStyle w:val="Compact"/>
       </w:pPr>
@@ -3629,12 +3653,6 @@
     <w:abstractNumId w:val="991"/>
   </w:num>
   <w:num w:numId="1024">
-    <w:abstractNumId w:val="991"/>
-  </w:num>
-  <w:num w:numId="1025">
-    <w:abstractNumId w:val="991"/>
-  </w:num>
-  <w:num w:numId="1026">
     <w:abstractNumId w:val="991"/>
   </w:num>
 </w:numbering>

</xml_diff>